<commit_message>
Updated full code with new feature”
</commit_message>
<xml_diff>
--- a/New Microsoft Office Word Document.docx
+++ b/New Microsoft Office Word Document.docx
@@ -247,21 +247,154 @@
     </w:p>
     <w:p>
       <w:pPr>
-        <w:rPr>
-          <w:rFonts w:ascii="Times New Roman" w:hAnsi="Times New Roman" w:cs="Times New Roman"/>
-          <w:sz w:val="24"/>
-          <w:szCs w:val="24"/>
-        </w:rPr>
-      </w:pPr>
-    </w:p>
-    <w:p>
-      <w:pPr>
-        <w:rPr>
-          <w:rFonts w:ascii="Times New Roman" w:hAnsi="Times New Roman" w:cs="Times New Roman"/>
-          <w:sz w:val="24"/>
-          <w:szCs w:val="24"/>
-        </w:rPr>
-      </w:pPr>
+        <w:tabs>
+          <w:tab w:val="left" w:pos="916"/>
+          <w:tab w:val="left" w:pos="1832"/>
+          <w:tab w:val="left" w:pos="2748"/>
+          <w:tab w:val="left" w:pos="3664"/>
+          <w:tab w:val="left" w:pos="4580"/>
+          <w:tab w:val="left" w:pos="5496"/>
+          <w:tab w:val="left" w:pos="6412"/>
+          <w:tab w:val="left" w:pos="7328"/>
+          <w:tab w:val="left" w:pos="8244"/>
+          <w:tab w:val="left" w:pos="9160"/>
+          <w:tab w:val="left" w:pos="10076"/>
+          <w:tab w:val="left" w:pos="10992"/>
+          <w:tab w:val="left" w:pos="11908"/>
+          <w:tab w:val="left" w:pos="12824"/>
+          <w:tab w:val="left" w:pos="13740"/>
+          <w:tab w:val="left" w:pos="14656"/>
+        </w:tabs>
+        <w:spacing w:after="0" w:line="240" w:lineRule="auto"/>
+        <w:rPr>
+          <w:rFonts w:ascii="Times New Roman" w:eastAsia="Times New Roman" w:hAnsi="Times New Roman" w:cs="Times New Roman"/>
+          <w:sz w:val="24"/>
+          <w:szCs w:val="24"/>
+        </w:rPr>
+      </w:pPr>
+    </w:p>
+    <w:p>
+      <w:pPr>
+        <w:tabs>
+          <w:tab w:val="left" w:pos="916"/>
+          <w:tab w:val="left" w:pos="1832"/>
+          <w:tab w:val="left" w:pos="2748"/>
+          <w:tab w:val="left" w:pos="3664"/>
+          <w:tab w:val="left" w:pos="4580"/>
+          <w:tab w:val="left" w:pos="5496"/>
+          <w:tab w:val="left" w:pos="6412"/>
+          <w:tab w:val="left" w:pos="7328"/>
+          <w:tab w:val="left" w:pos="8244"/>
+          <w:tab w:val="left" w:pos="9160"/>
+          <w:tab w:val="left" w:pos="10076"/>
+          <w:tab w:val="left" w:pos="10992"/>
+          <w:tab w:val="left" w:pos="11908"/>
+          <w:tab w:val="left" w:pos="12824"/>
+          <w:tab w:val="left" w:pos="13740"/>
+          <w:tab w:val="left" w:pos="14656"/>
+        </w:tabs>
+        <w:spacing w:after="0" w:line="240" w:lineRule="auto"/>
+        <w:rPr>
+          <w:rFonts w:ascii="Times New Roman" w:eastAsia="Times New Roman" w:hAnsi="Times New Roman" w:cs="Times New Roman"/>
+          <w:sz w:val="24"/>
+          <w:szCs w:val="24"/>
+        </w:rPr>
+      </w:pPr>
+    </w:p>
+    <w:p>
+      <w:pPr>
+        <w:tabs>
+          <w:tab w:val="left" w:pos="916"/>
+          <w:tab w:val="left" w:pos="1832"/>
+          <w:tab w:val="left" w:pos="2748"/>
+          <w:tab w:val="left" w:pos="3664"/>
+          <w:tab w:val="left" w:pos="4580"/>
+          <w:tab w:val="left" w:pos="5496"/>
+          <w:tab w:val="left" w:pos="6412"/>
+          <w:tab w:val="left" w:pos="7328"/>
+          <w:tab w:val="left" w:pos="8244"/>
+          <w:tab w:val="left" w:pos="9160"/>
+          <w:tab w:val="left" w:pos="10076"/>
+          <w:tab w:val="left" w:pos="10992"/>
+          <w:tab w:val="left" w:pos="11908"/>
+          <w:tab w:val="left" w:pos="12824"/>
+          <w:tab w:val="left" w:pos="13740"/>
+          <w:tab w:val="left" w:pos="14656"/>
+        </w:tabs>
+        <w:spacing w:after="0" w:line="240" w:lineRule="auto"/>
+        <w:rPr>
+          <w:rFonts w:ascii="Times New Roman" w:eastAsia="Times New Roman" w:hAnsi="Times New Roman" w:cs="Times New Roman"/>
+          <w:sz w:val="24"/>
+          <w:szCs w:val="24"/>
+        </w:rPr>
+      </w:pPr>
+    </w:p>
+    <w:p>
+      <w:pPr>
+        <w:rPr>
+          <w:rFonts w:ascii="Times New Roman" w:hAnsi="Times New Roman" w:cs="Times New Roman"/>
+          <w:sz w:val="24"/>
+          <w:szCs w:val="24"/>
+        </w:rPr>
+      </w:pPr>
+    </w:p>
+    <w:p>
+      <w:pPr>
+        <w:rPr>
+          <w:rFonts w:ascii="Times New Roman" w:hAnsi="Times New Roman" w:cs="Times New Roman"/>
+          <w:sz w:val="24"/>
+          <w:szCs w:val="24"/>
+        </w:rPr>
+      </w:pPr>
+      <w:proofErr w:type="spellStart"/>
+      <w:proofErr w:type="gramStart"/>
+      <w:r>
+        <w:rPr>
+          <w:rFonts w:ascii="Times New Roman" w:hAnsi="Times New Roman" w:cs="Times New Roman"/>
+          <w:sz w:val="24"/>
+          <w:szCs w:val="24"/>
+        </w:rPr>
+        <w:t>git</w:t>
+      </w:r>
+      <w:proofErr w:type="spellEnd"/>
+      <w:proofErr w:type="gramEnd"/>
+      <w:r>
+        <w:rPr>
+          <w:rFonts w:ascii="Times New Roman" w:hAnsi="Times New Roman" w:cs="Times New Roman"/>
+          <w:sz w:val="24"/>
+          <w:szCs w:val="24"/>
+        </w:rPr>
+        <w:t xml:space="preserve"> pull origin main --rebase</w:t>
+      </w:r>
+    </w:p>
+    <w:p>
+      <w:pPr>
+        <w:rPr>
+          <w:rFonts w:ascii="Times New Roman" w:hAnsi="Times New Roman" w:cs="Times New Roman"/>
+          <w:sz w:val="24"/>
+          <w:szCs w:val="24"/>
+        </w:rPr>
+      </w:pPr>
+      <w:proofErr w:type="spellStart"/>
+      <w:proofErr w:type="gramStart"/>
+      <w:r>
+        <w:rPr>
+          <w:rFonts w:ascii="Times New Roman" w:hAnsi="Times New Roman" w:cs="Times New Roman"/>
+          <w:sz w:val="24"/>
+          <w:szCs w:val="24"/>
+        </w:rPr>
+        <w:t>git</w:t>
+      </w:r>
+      <w:proofErr w:type="spellEnd"/>
+      <w:proofErr w:type="gramEnd"/>
+      <w:r>
+        <w:rPr>
+          <w:rFonts w:ascii="Times New Roman" w:hAnsi="Times New Roman" w:cs="Times New Roman"/>
+          <w:sz w:val="24"/>
+          <w:szCs w:val="24"/>
+        </w:rPr>
+        <w:t xml:space="preserve"> push origin main</w:t>
+      </w:r>
     </w:p>
     <w:sectPr>
       <w:pgSz w:w="12240" w:h="15840"/>

</xml_diff>